<commit_message>
Improve document review with Glade and Clio lessons
</commit_message>
<xml_diff>
--- a/reports/BK_FASTLANE_CRM_CONTACT_TO_PETITION_PREP_REPORT.docx
+++ b/reports/BK_FASTLANE_CRM_CONTACT_TO_PETITION_PREP_REPORT.docx
@@ -42,7 +42,7 @@
           <w:color w:val="667069"/>
           <w:sz w:val="27"/>
         </w:rPr>
-        <w:t>Plain-English product review for Jimmy Stein and Matt McCune</w:t>
+        <w:t>Plain-English product review for Jimmy Stein and Matt McCune · Glade + Clio competitive pass</w:t>
       </w:r>
     </w:p>
     <w:p>
@@ -155,6 +155,9 @@
         <w:gridCol w:w="9360"/>
       </w:tblGrid>
       <w:tr>
+        <w:trPr>
+          <w:tblHeader w:val="true"/>
+        </w:trPr>
         <w:tc>
           <w:tcPr>
             <w:tcW w:type="dxa" w:w="9360"/>
@@ -186,7 +189,7 @@
                 <w:color w:val="313C35"/>
                 <w:sz w:val="22"/>
               </w:rPr>
-              <w:t>The product direction is now clear enough to explain to a solo bankruptcy attorney in a few minutes. Keep this design and make the workflow secure, reliable, and connected before adding more screens.</w:t>
+              <w:t>The product direction is clear enough to explain to a solo bankruptcy attorney in a few minutes. The revised Document workflow adds the best practical lessons from Glade and Clio while preserving Matt's lean four-part structure.</w:t>
             </w:r>
           </w:p>
         </w:tc>
@@ -217,7 +220,7 @@
           <w:color w:val="313C35"/>
           <w:sz w:val="22"/>
         </w:rPr>
-        <w:t>The CRM is now centered on one job: move a potential bankruptcy client from first contact to a complete file that can be used to start preparing the petition.</w:t>
+        <w:t>The CRM is now centered on one job: move a potential bankruptcy client from first contact to a complete, firm-reviewed file that can be used to start preparing the petition.</w:t>
       </w:r>
     </w:p>
     <w:p>
@@ -255,6 +258,9 @@
         <w:gridCol w:w="3120"/>
       </w:tblGrid>
       <w:tr>
+        <w:trPr>
+          <w:tblHeader w:val="true"/>
+        </w:trPr>
         <w:tc>
           <w:tcPr>
             <w:tcW w:type="dxa" w:w="3120"/>
@@ -446,7 +452,7 @@
           <w:color w:val="313C35"/>
           <w:sz w:val="22"/>
         </w:rPr>
-        <w:t>Use this version as the product-design baseline. Do not add broad case-management or post-filing features yet. First connect this workflow to secure storage, the live Intake, and a controlled pilot.</w:t>
+        <w:t>Use this version as the product-design baseline. Keep improving the Intake-to-petition-prep path; do not add broad case-management or post-filing features yet. First connect this workflow to secure storage, the live Intake, and a controlled pilot.</w:t>
       </w:r>
     </w:p>
     <w:p>
@@ -610,6 +616,111 @@
           <w:color w:val="313C35"/>
           <w:sz w:val="22"/>
         </w:rPr>
+        <w:t>The Contact Document Review queue now comes before the follow-up action and shows debtor/spouse ownership, upload date, and version count.</w:t>
+      </w:r>
+    </w:p>
+    <w:p>
+      <w:pPr>
+        <w:pStyle w:val="ListBullet"/>
+        <w:spacing w:before="0" w:after="100" w:line="264" w:lineRule="auto"/>
+        <w:ind w:left="720" w:hanging="360"/>
+      </w:pPr>
+      <w:r>
+        <w:rPr>
+          <w:rFonts w:ascii="Calibri" w:hAnsi="Calibri"/>
+          <w:color w:val="313C35"/>
+          <w:sz w:val="22"/>
+        </w:rPr>
+        <w:t>Home Base contains only approved or excused Documents; unresolved work no longer appears in the resolved list.</w:t>
+      </w:r>
+    </w:p>
+    <w:p>
+      <w:pPr>
+        <w:pStyle w:val="ListBullet"/>
+        <w:spacing w:before="0" w:after="100" w:line="264" w:lineRule="auto"/>
+        <w:ind w:left="720" w:hanging="360"/>
+      </w:pPr>
+      <w:r>
+        <w:rPr>
+          <w:rFonts w:ascii="Calibri" w:hAnsi="Calibri"/>
+          <w:color w:val="313C35"/>
+          <w:sz w:val="22"/>
+        </w:rPr>
+        <w:t>Replacement uploads preserve history, and every firm decision records the reviewer and a Contact activity event.</w:t>
+      </w:r>
+    </w:p>
+    <w:p>
+      <w:pPr>
+        <w:pStyle w:val="ListBullet"/>
+        <w:spacing w:before="0" w:after="100" w:line="264" w:lineRule="auto"/>
+        <w:ind w:left="720" w:hanging="360"/>
+      </w:pPr>
+      <w:r>
+        <w:rPr>
+          <w:rFonts w:ascii="Calibri" w:hAnsi="Calibri"/>
+          <w:color w:val="313C35"/>
+          <w:sz w:val="22"/>
+        </w:rPr>
+        <w:t>Rejections separate the explanation sent to the client from the firm's internal note.</w:t>
+      </w:r>
+    </w:p>
+    <w:p>
+      <w:pPr>
+        <w:pStyle w:val="ListBullet"/>
+        <w:spacing w:before="0" w:after="100" w:line="264" w:lineRule="auto"/>
+        <w:ind w:left="720" w:hanging="360"/>
+      </w:pPr>
+      <w:r>
+        <w:rPr>
+          <w:rFonts w:ascii="Calibri" w:hAnsi="Calibri"/>
+          <w:color w:val="313C35"/>
+          <w:sz w:val="22"/>
+        </w:rPr>
+        <w:t>AI-flag overrides require a written firm reason.</w:t>
+      </w:r>
+    </w:p>
+    <w:p>
+      <w:pPr>
+        <w:pStyle w:val="ListBullet"/>
+        <w:spacing w:before="0" w:after="100" w:line="264" w:lineRule="auto"/>
+        <w:ind w:left="720" w:hanging="360"/>
+      </w:pPr>
+      <w:r>
+        <w:rPr>
+          <w:rFonts w:ascii="Calibri" w:hAnsi="Calibri"/>
+          <w:color w:val="313C35"/>
+          <w:sz w:val="22"/>
+        </w:rPr>
+        <w:t>Client follow-up remains disabled until all review decisions are finished and the assigned Task is open.</w:t>
+      </w:r>
+    </w:p>
+    <w:p>
+      <w:pPr>
+        <w:pStyle w:val="ListBullet"/>
+        <w:spacing w:before="0" w:after="100" w:line="264" w:lineRule="auto"/>
+        <w:ind w:left="720" w:hanging="360"/>
+      </w:pPr>
+      <w:r>
+        <w:rPr>
+          <w:rFonts w:ascii="Calibri" w:hAnsi="Calibri"/>
+          <w:color w:val="313C35"/>
+          <w:sz w:val="22"/>
+        </w:rPr>
+        <w:t>The follow-up draft is editable, repeat reminders retain prior rejection reasons, and the demo does not overstate portal security.</w:t>
+      </w:r>
+    </w:p>
+    <w:p>
+      <w:pPr>
+        <w:pStyle w:val="ListBullet"/>
+        <w:spacing w:before="0" w:after="100" w:line="264" w:lineRule="auto"/>
+        <w:ind w:left="720" w:hanging="360"/>
+      </w:pPr>
+      <w:r>
+        <w:rPr>
+          <w:rFonts w:ascii="Calibri" w:hAnsi="Calibri"/>
+          <w:color w:val="313C35"/>
+          <w:sz w:val="22"/>
+        </w:rPr>
         <w:t>Hover explanations and a fake-data-only banner make the demo easier and safer to understand.</w:t>
       </w:r>
     </w:p>
@@ -620,7 +731,7 @@
       <w:r>
         <w:drawing>
           <wp:inline xmlns:a="http://schemas.openxmlformats.org/drawingml/2006/main" xmlns:pic="http://schemas.openxmlformats.org/drawingml/2006/picture">
-            <wp:extent cx="5715000" cy="3135312"/>
+            <wp:extent cx="5715000" cy="3418234"/>
             <wp:docPr id="1" name="Picture 1" descr="Figure 1. The live Dashboard gives the firm one prioritized work list and makes the lifecycle visible."/>
             <wp:cNvGraphicFramePr>
               <a:graphicFrameLocks noChangeAspect="1"/>
@@ -641,7 +752,7 @@
                   <pic:spPr>
                     <a:xfrm>
                       <a:off x="0" y="0"/>
-                      <a:ext cx="5715000" cy="3135312"/>
+                      <a:ext cx="5715000" cy="3418234"/>
                     </a:xfrm>
                     <a:prstGeom prst="rect"/>
                   </pic:spPr>
@@ -780,8 +891,8 @@
       <w:r>
         <w:drawing>
           <wp:inline xmlns:a="http://schemas.openxmlformats.org/drawingml/2006/main" xmlns:pic="http://schemas.openxmlformats.org/drawingml/2006/picture">
-            <wp:extent cx="5715000" cy="3690938"/>
-            <wp:docPr id="2" name="Picture 2" descr="Figure 2. A Contact record shows the next step and keeps Intake data and document readiness separate."/>
+            <wp:extent cx="5715000" cy="4171861"/>
+            <wp:docPr id="2" name="Picture 2" descr="Figure 2. Contact Document Review keeps firm decisions above resolved work and the client chase list."/>
             <wp:cNvGraphicFramePr>
               <a:graphicFrameLocks noChangeAspect="1"/>
             </wp:cNvGraphicFramePr>
@@ -801,7 +912,7 @@
                   <pic:spPr>
                     <a:xfrm>
                       <a:off x="0" y="0"/>
-                      <a:ext cx="5715000" cy="3690938"/>
+                      <a:ext cx="5715000" cy="4171861"/>
                     </a:xfrm>
                     <a:prstGeom prst="rect"/>
                   </pic:spPr>
@@ -824,12 +935,91 @@
           <w:color w:val="667069"/>
           <w:sz w:val="19"/>
         </w:rPr>
-        <w:t>Figure 2. A Contact record shows the next step and keeps Intake data and document readiness separate.</w:t>
+        <w:t>Figure 2. Contact Document Review keeps firm decisions above resolved work and the client chase list.</w:t>
       </w:r>
     </w:p>
     <w:p>
+      <w:pPr>
+        <w:pStyle w:val="Heading2"/>
+        <w:keepNext/>
+      </w:pPr>
       <w:r>
-        <w:br w:type="page"/>
+        <w:t>The revised Document decision loop</w:t>
+      </w:r>
+    </w:p>
+    <w:p>
+      <w:pPr>
+        <w:pStyle w:val="ListBullet"/>
+        <w:spacing w:before="0" w:after="100" w:line="264" w:lineRule="auto"/>
+        <w:ind w:left="720" w:hanging="360"/>
+      </w:pPr>
+      <w:r>
+        <w:rPr>
+          <w:rFonts w:ascii="Calibri" w:hAnsi="Calibri"/>
+          <w:color w:val="313C35"/>
+          <w:sz w:val="22"/>
+        </w:rPr>
+        <w:t>Review every new upload or debtor explanation before contacting the client.</w:t>
+      </w:r>
+    </w:p>
+    <w:p>
+      <w:pPr>
+        <w:pStyle w:val="ListBullet"/>
+        <w:spacing w:before="0" w:after="100" w:line="264" w:lineRule="auto"/>
+        <w:ind w:left="720" w:hanging="360"/>
+      </w:pPr>
+      <w:r>
+        <w:rPr>
+          <w:rFonts w:ascii="Calibri" w:hAnsi="Calibri"/>
+          <w:color w:val="313C35"/>
+          <w:sz w:val="22"/>
+        </w:rPr>
+        <w:t>Approve, reject, excuse, or record a reason when overriding an AI flag.</w:t>
+      </w:r>
+    </w:p>
+    <w:p>
+      <w:pPr>
+        <w:pStyle w:val="ListBullet"/>
+        <w:spacing w:before="0" w:after="100" w:line="264" w:lineRule="auto"/>
+        <w:ind w:left="720" w:hanging="360"/>
+      </w:pPr>
+      <w:r>
+        <w:rPr>
+          <w:rFonts w:ascii="Calibri" w:hAnsi="Calibri"/>
+          <w:color w:val="313C35"/>
+          <w:sz w:val="22"/>
+        </w:rPr>
+        <w:t>Keep prior files and decisions in the Contact history instead of replacing evidence silently.</w:t>
+      </w:r>
+    </w:p>
+    <w:p>
+      <w:pPr>
+        <w:pStyle w:val="ListBullet"/>
+        <w:spacing w:before="0" w:after="100" w:line="264" w:lineRule="auto"/>
+        <w:ind w:left="720" w:hanging="360"/>
+      </w:pPr>
+      <w:r>
+        <w:rPr>
+          <w:rFonts w:ascii="Calibri" w:hAnsi="Calibri"/>
+          <w:color w:val="313C35"/>
+          <w:sz w:val="22"/>
+        </w:rPr>
+        <w:t>Open the editable follow-up only when the review queue is empty and the assigned Task is ready.</w:t>
+      </w:r>
+    </w:p>
+    <w:p>
+      <w:pPr>
+        <w:pStyle w:val="ListBullet"/>
+        <w:spacing w:before="0" w:after="100" w:line="264" w:lineRule="auto"/>
+        <w:ind w:left="720" w:hanging="360"/>
+      </w:pPr>
+      <w:r>
+        <w:rPr>
+          <w:rFonts w:ascii="Calibri" w:hAnsi="Calibri"/>
+          <w:color w:val="313C35"/>
+          <w:sz w:val="22"/>
+        </w:rPr>
+        <w:t>Use an expiring, per-Contact portal link in production and record delivery.</w:t>
       </w:r>
     </w:p>
     <w:p>
@@ -953,7 +1143,53 @@
           <w:color w:val="313C35"/>
           <w:sz w:val="22"/>
         </w:rPr>
-        <w:t xml:space="preserve"> AI may flag or preliminarily accept an upload, but the firm approves, rejects, or excuses it.</w:t>
+        <w:t xml:space="preserve"> AI may flag or preliminarily accept an upload, but the firm approves, rejects, excuses, or explains an override.</w:t>
+      </w:r>
+    </w:p>
+    <w:p>
+      <w:pPr>
+        <w:spacing w:before="0" w:after="120" w:line="264" w:lineRule="auto"/>
+      </w:pPr>
+      <w:r>
+        <w:rPr>
+          <w:rFonts w:ascii="Calibri" w:hAnsi="Calibri"/>
+          <w:b/>
+          <w:color w:val="313C35"/>
+          <w:sz w:val="22"/>
+        </w:rPr>
+        <w:t>The client request follows the review.</w:t>
+      </w:r>
+      <w:r>
+        <w:rPr>
+          <w:rFonts w:ascii="Calibri" w:hAnsi="Calibri"/>
+          <w:i w:val="0"/>
+          <w:color w:val="313C35"/>
+          <w:sz w:val="22"/>
+        </w:rPr>
+        <w:t xml:space="preserve"> A follow-up cannot be sent while a Document decision is unfinished, and the responsible Task must be open.</w:t>
+      </w:r>
+    </w:p>
+    <w:p>
+      <w:pPr>
+        <w:spacing w:before="0" w:after="120" w:line="264" w:lineRule="auto"/>
+      </w:pPr>
+      <w:r>
+        <w:rPr>
+          <w:rFonts w:ascii="Calibri" w:hAnsi="Calibri"/>
+          <w:b/>
+          <w:color w:val="313C35"/>
+          <w:sz w:val="22"/>
+        </w:rPr>
+        <w:t>Replacement evidence stays visible.</w:t>
+      </w:r>
+      <w:r>
+        <w:rPr>
+          <w:rFonts w:ascii="Calibri" w:hAnsi="Calibri"/>
+          <w:i w:val="0"/>
+          <w:color w:val="313C35"/>
+          <w:sz w:val="22"/>
+        </w:rPr>
+        <w:t xml:space="preserve"> The design now keeps an upload history and shows who made the most recent decision.</w:t>
       </w:r>
     </w:p>
     <w:p>
@@ -1007,6 +1243,9 @@
         <w:gridCol w:w="9360"/>
       </w:tblGrid>
       <w:tr>
+        <w:trPr>
+          <w:tblHeader w:val="true"/>
+        </w:trPr>
         <w:tc>
           <w:tcPr>
             <w:tcW w:type="dxa" w:w="9360"/>
@@ -1263,17 +1502,58 @@
       </w:r>
     </w:p>
     <w:p>
+      <w:pPr>
+        <w:pStyle w:val="Heading1"/>
+        <w:keepNext/>
+      </w:pPr>
       <w:r>
-        <w:br w:type="page"/>
+        <w:t>Competitive lessons applied</w:t>
       </w:r>
     </w:p>
     <w:p>
       <w:pPr>
-        <w:pStyle w:val="Heading1"/>
+        <w:pStyle w:val="Heading2"/>
         <w:keepNext/>
       </w:pPr>
       <w:r>
-        <w:t>Competitive lessons applied</w:t>
+        <w:t>Glade</w:t>
+      </w:r>
+    </w:p>
+    <w:p>
+      <w:pPr>
+        <w:spacing w:before="0" w:after="120" w:line="264" w:lineRule="auto"/>
+      </w:pPr>
+      <w:r>
+        <w:rPr>
+          <w:rFonts w:ascii="Calibri" w:hAnsi="Calibri"/>
+          <w:i w:val="0"/>
+          <w:color w:val="313C35"/>
+          <w:sz w:val="22"/>
+        </w:rPr>
+        <w:t>Glade is the closest comparison because it is designed around bankruptcy work. Its strongest lesson is to let Intake, Documents, communication, and case work build one continuous bankruptcy file instead of forcing staff to re-enter information across disconnected tools.</w:t>
+      </w:r>
+    </w:p>
+    <w:p>
+      <w:pPr>
+        <w:pStyle w:val="Heading2"/>
+        <w:keepNext/>
+      </w:pPr>
+      <w:r>
+        <w:t>Clio</w:t>
+      </w:r>
+    </w:p>
+    <w:p>
+      <w:pPr>
+        <w:spacing w:before="0" w:after="120" w:line="264" w:lineRule="auto"/>
+      </w:pPr>
+      <w:r>
+        <w:rPr>
+          <w:rFonts w:ascii="Calibri" w:hAnsi="Calibri"/>
+          <w:i w:val="0"/>
+          <w:color w:val="313C35"/>
+          <w:sz w:val="22"/>
+        </w:rPr>
+        <w:t>Clio demonstrates the operating discipline expected from legal software: work belongs to an owner and due date; Documents carry useful metadata; decisions appear in the record history; workflows follow stages; and client sharing uses controlled portal access.</w:t>
       </w:r>
     </w:p>
     <w:p>
@@ -1366,6 +1646,60 @@
           <w:sz w:val="22"/>
         </w:rPr>
         <w:t>Mature petition-preparation software already owns forms preparation and filing. BK FastLane should export or integrate later, not reproduce it here.</w:t>
+      </w:r>
+    </w:p>
+    <w:p>
+      <w:pPr>
+        <w:pStyle w:val="Heading2"/>
+        <w:keepNext/>
+      </w:pPr>
+      <w:r>
+        <w:t>What BK FastLane adopted</w:t>
+      </w:r>
+    </w:p>
+    <w:p>
+      <w:pPr>
+        <w:pStyle w:val="ListBullet"/>
+        <w:spacing w:before="0" w:after="100" w:line="264" w:lineRule="auto"/>
+        <w:ind w:left="720" w:hanging="360"/>
+      </w:pPr>
+      <w:r>
+        <w:rPr>
+          <w:rFonts w:ascii="Calibri" w:hAnsi="Calibri"/>
+          <w:color w:val="313C35"/>
+          <w:sz w:val="22"/>
+        </w:rPr>
+        <w:t>From Glade: bankruptcy-specific language, one Contact case file, and automation that handles administration while the firm keeps legal judgment.</w:t>
+      </w:r>
+    </w:p>
+    <w:p>
+      <w:pPr>
+        <w:pStyle w:val="ListBullet"/>
+        <w:spacing w:before="0" w:after="100" w:line="264" w:lineRule="auto"/>
+        <w:ind w:left="720" w:hanging="360"/>
+      </w:pPr>
+      <w:r>
+        <w:rPr>
+          <w:rFonts w:ascii="Calibri" w:hAnsi="Calibri"/>
+          <w:color w:val="313C35"/>
+          <w:sz w:val="22"/>
+        </w:rPr>
+        <w:t>From Clio: assigned Tasks, Document metadata and history, editable communications, controlled client access, and auditable decisions.</w:t>
+      </w:r>
+    </w:p>
+    <w:p>
+      <w:pPr>
+        <w:pStyle w:val="ListBullet"/>
+        <w:spacing w:before="0" w:after="100" w:line="264" w:lineRule="auto"/>
+        <w:ind w:left="720" w:hanging="360"/>
+      </w:pPr>
+      <w:r>
+        <w:rPr>
+          <w:rFonts w:ascii="Calibri" w:hAnsi="Calibri"/>
+          <w:color w:val="313C35"/>
+          <w:sz w:val="22"/>
+        </w:rPr>
+        <w:t>From both: keep the client journey and the firm's work connected, but do not bury a small firm under configuration.</w:t>
       </w:r>
     </w:p>
     <w:tbl>
@@ -1387,6 +1721,9 @@
         <w:gridCol w:w="9360"/>
       </w:tblGrid>
       <w:tr>
+        <w:trPr>
+          <w:tblHeader w:val="true"/>
+        </w:trPr>
         <w:tc>
           <w:tcPr>
             <w:tcW w:type="dxa" w:w="9360"/>
@@ -1519,7 +1856,22 @@
           <w:color w:val="313C35"/>
           <w:sz w:val="22"/>
         </w:rPr>
-        <w:t>Complete the real document-review and follow-up loop.</w:t>
+        <w:t>Implement the append-only Document bundle, real inline viewer, and complete review/follow-up loop.</w:t>
+      </w:r>
+    </w:p>
+    <w:p>
+      <w:pPr>
+        <w:pStyle w:val="ListBullet"/>
+        <w:spacing w:before="0" w:after="100" w:line="264" w:lineRule="auto"/>
+        <w:ind w:left="720" w:hanging="360"/>
+      </w:pPr>
+      <w:r>
+        <w:rPr>
+          <w:rFonts w:ascii="Calibri" w:hAnsi="Calibri"/>
+          <w:color w:val="313C35"/>
+          <w:sz w:val="22"/>
+        </w:rPr>
+        <w:t>Issue expiring, per-Contact client-portal invitations and record message delivery.</w:t>
       </w:r>
     </w:p>
     <w:p>
@@ -1803,6 +2155,9 @@
         <w:gridCol w:w="4680"/>
       </w:tblGrid>
       <w:tr>
+        <w:trPr>
+          <w:tblHeader w:val="true"/>
+        </w:trPr>
         <w:tc>
           <w:tcPr>
             <w:tcW w:type="dxa" w:w="7000"/>
@@ -2132,6 +2487,9 @@
         <w:gridCol w:w="4680"/>
       </w:tblGrid>
       <w:tr>
+        <w:trPr>
+          <w:tblHeader w:val="true"/>
+        </w:trPr>
         <w:tc>
           <w:tcPr>
             <w:tcW w:type="dxa" w:w="2700"/>
@@ -2289,7 +2647,7 @@
                 <w:color w:val="667069"/>
                 <w:sz w:val="19"/>
               </w:rPr>
-              <w:t>d59accaa6dab9c26e94d261a0c287cf6295f429e</w:t>
+              <w:t>See current head of codex/jimmy-contact-to-petition-ready</w:t>
             </w:r>
           </w:p>
         </w:tc>
@@ -2462,6 +2820,11 @@
       </w:pPr>
     </w:p>
     <w:p>
+      <w:r>
+        <w:br w:type="page"/>
+      </w:r>
+    </w:p>
+    <w:p>
       <w:pPr>
         <w:pStyle w:val="Heading1"/>
         <w:keepNext/>
@@ -2473,77 +2836,223 @@
     <w:p>
       <w:pPr>
         <w:pStyle w:val="ListBullet"/>
-        <w:spacing w:before="0" w:after="100" w:line="264" w:lineRule="auto"/>
+        <w:spacing w:before="0" w:after="60"/>
         <w:ind w:left="720" w:hanging="360"/>
       </w:pPr>
-      <w:r>
-        <w:rPr>
-          <w:rFonts w:ascii="Calibri" w:hAnsi="Calibri"/>
-          <w:color w:val="313C35"/>
-          <w:sz w:val="22"/>
-        </w:rPr>
-        <w:t>BK Questionnaire: https://www.bkquestionnaire.com/</w:t>
-      </w:r>
+      <w:hyperlink r:id="rId14">
+        <w:r>
+          <w:rPr>
+            <w:rFonts w:ascii="Calibri" w:hAnsi="Calibri"/>
+            <w:color w:val="214E5F"/>
+            <w:u w:val="single"/>
+          </w:rPr>
+          <w:t>Glade</w:t>
+        </w:r>
+      </w:hyperlink>
     </w:p>
     <w:p>
       <w:pPr>
         <w:pStyle w:val="ListBullet"/>
-        <w:spacing w:before="0" w:after="100" w:line="264" w:lineRule="auto"/>
+        <w:spacing w:before="0" w:after="60"/>
         <w:ind w:left="720" w:hanging="360"/>
       </w:pPr>
-      <w:r>
-        <w:rPr>
-          <w:rFonts w:ascii="Calibri" w:hAnsi="Calibri"/>
-          <w:color w:val="313C35"/>
-          <w:sz w:val="22"/>
-        </w:rPr>
-        <w:t>BK Questionnaire pricing: https://www.bkquestionnaire.com/public/pricing</w:t>
-      </w:r>
+      <w:hyperlink r:id="rId15">
+        <w:r>
+          <w:rPr>
+            <w:rFonts w:ascii="Calibri" w:hAnsi="Calibri"/>
+            <w:color w:val="214E5F"/>
+            <w:u w:val="single"/>
+          </w:rPr>
+          <w:t>Glade Help Center</w:t>
+        </w:r>
+      </w:hyperlink>
     </w:p>
     <w:p>
       <w:pPr>
         <w:pStyle w:val="ListBullet"/>
-        <w:spacing w:before="0" w:after="100" w:line="264" w:lineRule="auto"/>
+        <w:spacing w:before="0" w:after="60"/>
         <w:ind w:left="720" w:hanging="360"/>
       </w:pPr>
-      <w:r>
-        <w:rPr>
-          <w:rFonts w:ascii="Calibri" w:hAnsi="Calibri"/>
-          <w:color w:val="313C35"/>
-          <w:sz w:val="22"/>
-        </w:rPr>
-        <w:t>NextChapter / MyChapter: https://app.nextchapterbk.com/sign_in_attempts/new</w:t>
-      </w:r>
+      <w:hyperlink r:id="rId16">
+        <w:r>
+          <w:rPr>
+            <w:rFonts w:ascii="Calibri" w:hAnsi="Calibri"/>
+            <w:color w:val="214E5F"/>
+            <w:u w:val="single"/>
+          </w:rPr>
+          <w:t>Clio features</w:t>
+        </w:r>
+      </w:hyperlink>
     </w:p>
     <w:p>
       <w:pPr>
         <w:pStyle w:val="ListBullet"/>
-        <w:spacing w:before="0" w:after="100" w:line="264" w:lineRule="auto"/>
+        <w:spacing w:before="0" w:after="60"/>
         <w:ind w:left="720" w:hanging="360"/>
       </w:pPr>
-      <w:r>
-        <w:rPr>
-          <w:rFonts w:ascii="Calibri" w:hAnsi="Calibri"/>
-          <w:color w:val="313C35"/>
-          <w:sz w:val="22"/>
-        </w:rPr>
-        <w:t>Jubilee: https://www.jubileepro.com/</w:t>
-      </w:r>
+      <w:hyperlink r:id="rId17">
+        <w:r>
+          <w:rPr>
+            <w:rFonts w:ascii="Calibri" w:hAnsi="Calibri"/>
+            <w:color w:val="214E5F"/>
+            <w:u w:val="single"/>
+          </w:rPr>
+          <w:t>Clio Grow</w:t>
+        </w:r>
+      </w:hyperlink>
     </w:p>
     <w:p>
       <w:pPr>
         <w:pStyle w:val="ListBullet"/>
-        <w:spacing w:before="0" w:after="100" w:line="264" w:lineRule="auto"/>
+        <w:spacing w:before="0" w:after="60"/>
         <w:ind w:left="720" w:hanging="360"/>
       </w:pPr>
-      <w:r>
-        <w:rPr>
-          <w:rFonts w:ascii="Calibri" w:hAnsi="Calibri"/>
-          <w:color w:val="313C35"/>
-          <w:sz w:val="22"/>
-        </w:rPr>
-        <w:t>Stretto Best Case: https://www.stretto.com/bankruptcy-software-services/best-case/</w:t>
-      </w:r>
+      <w:hyperlink r:id="rId18">
+        <w:r>
+          <w:rPr>
+            <w:rFonts w:ascii="Calibri" w:hAnsi="Calibri"/>
+            <w:color w:val="214E5F"/>
+            <w:u w:val="single"/>
+          </w:rPr>
+          <w:t>Clio Tasks</w:t>
+        </w:r>
+      </w:hyperlink>
+    </w:p>
+    <w:p>
+      <w:pPr>
+        <w:pStyle w:val="ListBullet"/>
+        <w:spacing w:before="0" w:after="60"/>
+        <w:ind w:left="720" w:hanging="360"/>
+      </w:pPr>
+      <w:hyperlink r:id="rId19">
+        <w:r>
+          <w:rPr>
+            <w:rFonts w:ascii="Calibri" w:hAnsi="Calibri"/>
+            <w:color w:val="214E5F"/>
+            <w:u w:val="single"/>
+          </w:rPr>
+          <w:t>Clio Documents</w:t>
+        </w:r>
+      </w:hyperlink>
+    </w:p>
+    <w:p>
+      <w:pPr>
+        <w:pStyle w:val="ListBullet"/>
+        <w:spacing w:before="0" w:after="60"/>
+        <w:ind w:left="720" w:hanging="360"/>
+      </w:pPr>
+      <w:hyperlink r:id="rId20">
+        <w:r>
+          <w:rPr>
+            <w:rFonts w:ascii="Calibri" w:hAnsi="Calibri"/>
+            <w:color w:val="214E5F"/>
+            <w:u w:val="single"/>
+          </w:rPr>
+          <w:t>Clio automated workflows</w:t>
+        </w:r>
+      </w:hyperlink>
+    </w:p>
+    <w:p>
+      <w:pPr>
+        <w:pStyle w:val="ListBullet"/>
+        <w:spacing w:before="0" w:after="60"/>
+        <w:ind w:left="720" w:hanging="360"/>
+      </w:pPr>
+      <w:hyperlink r:id="rId21">
+        <w:r>
+          <w:rPr>
+            <w:rFonts w:ascii="Calibri" w:hAnsi="Calibri"/>
+            <w:color w:val="214E5F"/>
+            <w:u w:val="single"/>
+          </w:rPr>
+          <w:t>Clio client portal</w:t>
+        </w:r>
+      </w:hyperlink>
+    </w:p>
+    <w:p>
+      <w:pPr>
+        <w:pStyle w:val="ListBullet"/>
+        <w:spacing w:before="0" w:after="60"/>
+        <w:ind w:left="720" w:hanging="360"/>
+      </w:pPr>
+      <w:hyperlink r:id="rId22">
+        <w:r>
+          <w:rPr>
+            <w:rFonts w:ascii="Calibri" w:hAnsi="Calibri"/>
+            <w:color w:val="214E5F"/>
+            <w:u w:val="single"/>
+          </w:rPr>
+          <w:t>BK Questionnaire</w:t>
+        </w:r>
+      </w:hyperlink>
+    </w:p>
+    <w:p>
+      <w:pPr>
+        <w:pStyle w:val="ListBullet"/>
+        <w:spacing w:before="0" w:after="60"/>
+        <w:ind w:left="720" w:hanging="360"/>
+      </w:pPr>
+      <w:hyperlink r:id="rId23">
+        <w:r>
+          <w:rPr>
+            <w:rFonts w:ascii="Calibri" w:hAnsi="Calibri"/>
+            <w:color w:val="214E5F"/>
+            <w:u w:val="single"/>
+          </w:rPr>
+          <w:t>BK Questionnaire pricing</w:t>
+        </w:r>
+      </w:hyperlink>
+    </w:p>
+    <w:p>
+      <w:pPr>
+        <w:pStyle w:val="ListBullet"/>
+        <w:spacing w:before="0" w:after="60"/>
+        <w:ind w:left="720" w:hanging="360"/>
+      </w:pPr>
+      <w:hyperlink r:id="rId24">
+        <w:r>
+          <w:rPr>
+            <w:rFonts w:ascii="Calibri" w:hAnsi="Calibri"/>
+            <w:color w:val="214E5F"/>
+            <w:u w:val="single"/>
+          </w:rPr>
+          <w:t>NextChapter / MyChapter</w:t>
+        </w:r>
+      </w:hyperlink>
+    </w:p>
+    <w:p>
+      <w:pPr>
+        <w:pStyle w:val="ListBullet"/>
+        <w:spacing w:before="0" w:after="60"/>
+        <w:ind w:left="720" w:hanging="360"/>
+      </w:pPr>
+      <w:hyperlink r:id="rId25">
+        <w:r>
+          <w:rPr>
+            <w:rFonts w:ascii="Calibri" w:hAnsi="Calibri"/>
+            <w:color w:val="214E5F"/>
+            <w:u w:val="single"/>
+          </w:rPr>
+          <w:t>Jubilee</w:t>
+        </w:r>
+      </w:hyperlink>
+    </w:p>
+    <w:p>
+      <w:pPr>
+        <w:pStyle w:val="ListBullet"/>
+        <w:spacing w:before="0" w:after="60"/>
+        <w:ind w:left="720" w:hanging="360"/>
+      </w:pPr>
+      <w:hyperlink r:id="rId26">
+        <w:r>
+          <w:rPr>
+            <w:rFonts w:ascii="Calibri" w:hAnsi="Calibri"/>
+            <w:color w:val="214E5F"/>
+            <w:u w:val="single"/>
+          </w:rPr>
+          <w:t>Stretto Best Case</w:t>
+        </w:r>
+      </w:hyperlink>
     </w:p>
     <w:sectPr>
       <w:headerReference w:type="default" r:id="rId9"/>

</xml_diff>